<commit_message>
refactor: generalize documentation, OpenAPI specs, and build plans for portfolio
</commit_message>
<xml_diff>
--- a/BankEase_Project_Build_Plan.docx
+++ b/BankEase_Project_Build_Plan.docx
@@ -45,7 +45,7 @@
           <w:iCs/>
           <w:color w:val="666666"/>
         </w:rPr>
-        <w:t>Prepared for: Kotak Tech — Associate III Software Engineering application</w:t>
+        <w:t>Prepared for: Enterprise Core Banking Backend Engineering</w:t>
       </w:r>
     </w:p>
     <w:p>
@@ -85,7 +85,7 @@
           <w:sz w:val="22"/>
           <w:szCs w:val="22"/>
         </w:rPr>
-        <w:t xml:space="preserve"> is a simplified core-banking backend built as a set of independent microservices. It models account management and money-transfer operations — the same domain Kotak's engineering team works in — using the exact stack listed in the job description: Java, Spring Boot, Microservices, REST APIs, Docker, and relational DBMS.</w:t>
+        <w:t xml:space="preserve"> is a simplified core-banking backend built as a set of independent microservices. It models account management and money-transfer operations using the exact stack listed in the job description: Java, Spring Boot, Microservices, REST APIs, Docker, and relational DBMS.</w:t>
       </w:r>
     </w:p>
     <w:p>
@@ -5766,7 +5766,7 @@
         <w:spacing w:before="320" w:after="160"/>
       </w:pPr>
       <w:r>
-        <w:t>12. Notes on Positioning for Kotak</w:t>
+        <w:t>12. Notes on Resume Positioning &amp; Technical Interviews</w:t>
       </w:r>
     </w:p>
     <w:p>
@@ -5779,7 +5779,7 @@
           <w:sz w:val="22"/>
           <w:szCs w:val="22"/>
         </w:rPr>
-        <w:t>Once built, reframe the resume bullets to mirror the JD's own language:</w:t>
+        <w:t>Once built, reframe the resume bullets to highlight key architectural achievements:</w:t>
       </w:r>
     </w:p>
     <w:p>

</xml_diff>